<commit_message>
implement the majority of models
</commit_message>
<xml_diff>
--- a/To-Do-List.docx
+++ b/To-Do-List.docx
@@ -89,122 +89,108 @@
           <w:lang w:val="en-US"/>
         </w:rPr>
       </w:pPr>
-      <w:r>
-        <w:rPr>
-          <w:rFonts w:ascii="Roboto Condensed" w:eastAsia="Times New Roman" w:hAnsi="Roboto Condensed" w:cs="Courier New"/>
-          <w:lang w:val="en-US"/>
-        </w:rPr>
-        <w:t>Sprint Planning:</w:t>
-      </w:r>
-    </w:p>
-    <w:p>
-      <w:pPr>
-        <w:tabs>
-          <w:tab w:val="left" w:pos="916"/>
-          <w:tab w:val="left" w:pos="1832"/>
-          <w:tab w:val="left" w:pos="2748"/>
-          <w:tab w:val="left" w:pos="3664"/>
-          <w:tab w:val="left" w:pos="4580"/>
-          <w:tab w:val="left" w:pos="5496"/>
-          <w:tab w:val="left" w:pos="6412"/>
-          <w:tab w:val="left" w:pos="7328"/>
-          <w:tab w:val="left" w:pos="8244"/>
-          <w:tab w:val="left" w:pos="9160"/>
-          <w:tab w:val="left" w:pos="10076"/>
-          <w:tab w:val="left" w:pos="10992"/>
-          <w:tab w:val="left" w:pos="11908"/>
-          <w:tab w:val="left" w:pos="12824"/>
-          <w:tab w:val="left" w:pos="13740"/>
-          <w:tab w:val="left" w:pos="14656"/>
-        </w:tabs>
-        <w:spacing w:after="0" w:line="23" w:lineRule="atLeast"/>
-        <w:rPr>
-          <w:rFonts w:ascii="Roboto Condensed" w:eastAsia="Times New Roman" w:hAnsi="Roboto Condensed" w:cs="Courier New"/>
-          <w:lang w:val="en-US"/>
-        </w:rPr>
-      </w:pPr>
-      <w:r>
-        <w:rPr>
-          <w:rFonts w:ascii="Roboto Condensed" w:eastAsia="Times New Roman" w:hAnsi="Roboto Condensed" w:cs="Courier New"/>
-          <w:lang w:val="en-US"/>
-        </w:rPr>
-        <w:t>The sprint goal was to implement contact history and replaceable communication provider architecture. The selected work included ContactEvent entity/repository, CommunicationService, EmailProvider and SmsProvider interfaces, mock providers for development/test, provider-ready placeholders, environment flag for production sending, sent/failed/opened/clicked/replied event types, unsubscribe handling, contact timeline endpoint, retry logic, communication logs, and contact history UI.</w:t>
-      </w:r>
-    </w:p>
-    <w:p>
-      <w:pPr>
-        <w:tabs>
-          <w:tab w:val="left" w:pos="916"/>
-          <w:tab w:val="left" w:pos="1832"/>
-          <w:tab w:val="left" w:pos="2748"/>
-          <w:tab w:val="left" w:pos="3664"/>
-          <w:tab w:val="left" w:pos="4580"/>
-          <w:tab w:val="left" w:pos="5496"/>
-          <w:tab w:val="left" w:pos="6412"/>
-          <w:tab w:val="left" w:pos="7328"/>
-          <w:tab w:val="left" w:pos="8244"/>
-          <w:tab w:val="left" w:pos="9160"/>
-          <w:tab w:val="left" w:pos="10076"/>
-          <w:tab w:val="left" w:pos="10992"/>
-          <w:tab w:val="left" w:pos="11908"/>
-          <w:tab w:val="left" w:pos="12824"/>
-          <w:tab w:val="left" w:pos="13740"/>
-          <w:tab w:val="left" w:pos="14656"/>
-        </w:tabs>
-        <w:spacing w:after="0" w:line="23" w:lineRule="atLeast"/>
-        <w:rPr>
-          <w:rFonts w:ascii="Roboto Condensed" w:eastAsia="Times New Roman" w:hAnsi="Roboto Condensed" w:cs="Courier New"/>
-          <w:lang w:val="en-US"/>
-        </w:rPr>
-      </w:pPr>
-      <w:r>
-        <w:rPr>
-          <w:rFonts w:ascii="Roboto Condensed" w:eastAsia="Times New Roman" w:hAnsi="Roboto Condensed" w:cs="Courier New"/>
-          <w:lang w:val="en-US"/>
-        </w:rPr>
-        <w:t>Daily Scrum / Execution Summary:</w:t>
-      </w:r>
-    </w:p>
-    <w:p>
-      <w:pPr>
-        <w:tabs>
-          <w:tab w:val="left" w:pos="916"/>
-          <w:tab w:val="left" w:pos="1832"/>
-          <w:tab w:val="left" w:pos="2748"/>
-          <w:tab w:val="left" w:pos="3664"/>
-          <w:tab w:val="left" w:pos="4580"/>
-          <w:tab w:val="left" w:pos="5496"/>
-          <w:tab w:val="left" w:pos="6412"/>
-          <w:tab w:val="left" w:pos="7328"/>
-          <w:tab w:val="left" w:pos="8244"/>
-          <w:tab w:val="left" w:pos="9160"/>
-          <w:tab w:val="left" w:pos="10076"/>
-          <w:tab w:val="left" w:pos="10992"/>
-          <w:tab w:val="left" w:pos="11908"/>
-          <w:tab w:val="left" w:pos="12824"/>
-          <w:tab w:val="left" w:pos="13740"/>
-          <w:tab w:val="left" w:pos="14656"/>
-        </w:tabs>
-        <w:spacing w:after="0" w:line="23" w:lineRule="atLeast"/>
-        <w:rPr>
-          <w:rFonts w:ascii="Roboto Condensed" w:eastAsia="Times New Roman" w:hAnsi="Roboto Condensed" w:cs="Courier New"/>
-          <w:lang w:val="en-US"/>
-        </w:rPr>
-      </w:pPr>
-      <w:r>
-        <w:rPr>
-          <w:rFonts w:ascii="Roboto Condensed" w:eastAsia="Times New Roman" w:hAnsi="Roboto Condensed" w:cs="Courier New"/>
-          <w:lang w:val="en-US"/>
-        </w:rPr>
-        <w:t xml:space="preserve">The sprint focused on tracking communication outcomes without depending on a real external provider during development. Work progressed on provider abstraction, mock email/SMS providers, event creation, </w:t>
-      </w:r>
+    </w:p>
+    <w:p>
+      <w:pPr>
+        <w:tabs>
+          <w:tab w:val="left" w:pos="916"/>
+          <w:tab w:val="left" w:pos="1832"/>
+          <w:tab w:val="left" w:pos="2748"/>
+          <w:tab w:val="left" w:pos="3664"/>
+          <w:tab w:val="left" w:pos="4580"/>
+          <w:tab w:val="left" w:pos="5496"/>
+          <w:tab w:val="left" w:pos="6412"/>
+          <w:tab w:val="left" w:pos="7328"/>
+          <w:tab w:val="left" w:pos="8244"/>
+          <w:tab w:val="left" w:pos="9160"/>
+          <w:tab w:val="left" w:pos="10076"/>
+          <w:tab w:val="left" w:pos="10992"/>
+          <w:tab w:val="left" w:pos="11908"/>
+          <w:tab w:val="left" w:pos="12824"/>
+          <w:tab w:val="left" w:pos="13740"/>
+          <w:tab w:val="left" w:pos="14656"/>
+        </w:tabs>
+        <w:spacing w:after="0" w:line="23" w:lineRule="atLeast"/>
+        <w:rPr>
+          <w:rFonts w:ascii="Roboto Condensed" w:eastAsia="Times New Roman" w:hAnsi="Roboto Condensed" w:cs="Courier New"/>
+          <w:lang w:val="en-US"/>
+        </w:rPr>
+      </w:pPr>
+      <w:r>
+        <w:rPr>
+          <w:rFonts w:ascii="Roboto Condensed" w:eastAsia="Times New Roman" w:hAnsi="Roboto Condensed" w:cs="Courier New"/>
+          <w:lang w:val="en-US"/>
+        </w:rPr>
+        <w:t>Evidence to Attach:</w:t>
+      </w:r>
+    </w:p>
+    <w:p>
+      <w:pPr>
+        <w:tabs>
+          <w:tab w:val="left" w:pos="916"/>
+          <w:tab w:val="left" w:pos="1832"/>
+          <w:tab w:val="left" w:pos="2748"/>
+          <w:tab w:val="left" w:pos="3664"/>
+          <w:tab w:val="left" w:pos="4580"/>
+          <w:tab w:val="left" w:pos="5496"/>
+          <w:tab w:val="left" w:pos="6412"/>
+          <w:tab w:val="left" w:pos="7328"/>
+          <w:tab w:val="left" w:pos="8244"/>
+          <w:tab w:val="left" w:pos="9160"/>
+          <w:tab w:val="left" w:pos="10076"/>
+          <w:tab w:val="left" w:pos="10992"/>
+          <w:tab w:val="left" w:pos="11908"/>
+          <w:tab w:val="left" w:pos="12824"/>
+          <w:tab w:val="left" w:pos="13740"/>
+          <w:tab w:val="left" w:pos="14656"/>
+        </w:tabs>
+        <w:spacing w:after="0" w:line="23" w:lineRule="atLeast"/>
+        <w:rPr>
+          <w:rFonts w:ascii="Roboto Condensed" w:eastAsia="Times New Roman" w:hAnsi="Roboto Condensed" w:cs="Courier New"/>
+          <w:lang w:val="en-US"/>
+        </w:rPr>
+      </w:pPr>
+      <w:r>
+        <w:rPr>
+          <w:rFonts w:ascii="Roboto Condensed" w:eastAsia="Times New Roman" w:hAnsi="Roboto Condensed" w:cs="Courier New"/>
+          <w:lang w:val="en-US"/>
+        </w:rPr>
+        <w:t xml:space="preserve">Contact history screenshot, </w:t>
+      </w:r>
+    </w:p>
+    <w:p>
+      <w:pPr>
+        <w:tabs>
+          <w:tab w:val="left" w:pos="916"/>
+          <w:tab w:val="left" w:pos="1832"/>
+          <w:tab w:val="left" w:pos="2748"/>
+          <w:tab w:val="left" w:pos="3664"/>
+          <w:tab w:val="left" w:pos="4580"/>
+          <w:tab w:val="left" w:pos="5496"/>
+          <w:tab w:val="left" w:pos="6412"/>
+          <w:tab w:val="left" w:pos="7328"/>
+          <w:tab w:val="left" w:pos="8244"/>
+          <w:tab w:val="left" w:pos="9160"/>
+          <w:tab w:val="left" w:pos="10076"/>
+          <w:tab w:val="left" w:pos="10992"/>
+          <w:tab w:val="left" w:pos="11908"/>
+          <w:tab w:val="left" w:pos="12824"/>
+          <w:tab w:val="left" w:pos="13740"/>
+          <w:tab w:val="left" w:pos="14656"/>
+        </w:tabs>
+        <w:spacing w:after="0" w:line="23" w:lineRule="atLeast"/>
+        <w:rPr>
+          <w:rFonts w:ascii="Roboto Condensed" w:eastAsia="Times New Roman" w:hAnsi="Roboto Condensed" w:cs="Courier New"/>
+          <w:lang w:val="en-US"/>
+        </w:rPr>
+      </w:pPr>
       <w:proofErr w:type="gramStart"/>
       <w:r>
         <w:rPr>
           <w:rFonts w:ascii="Roboto Condensed" w:eastAsia="Times New Roman" w:hAnsi="Roboto Condensed" w:cs="Courier New"/>
           <w:lang w:val="en-US"/>
         </w:rPr>
-        <w:t>unsubscribe</w:t>
+        <w:t>contact</w:t>
       </w:r>
       <w:proofErr w:type="gramEnd"/>
       <w:r>
@@ -212,382 +198,42 @@
           <w:rFonts w:ascii="Roboto Condensed" w:eastAsia="Times New Roman" w:hAnsi="Roboto Condensed" w:cs="Courier New"/>
           <w:lang w:val="en-US"/>
         </w:rPr>
-        <w:t>-to-opt-out behavior, retry limits, and customer contact timelines.</w:t>
-      </w:r>
-    </w:p>
-    <w:p>
-      <w:pPr>
-        <w:tabs>
-          <w:tab w:val="left" w:pos="916"/>
-          <w:tab w:val="left" w:pos="1832"/>
-          <w:tab w:val="left" w:pos="2748"/>
-          <w:tab w:val="left" w:pos="3664"/>
-          <w:tab w:val="left" w:pos="4580"/>
-          <w:tab w:val="left" w:pos="5496"/>
-          <w:tab w:val="left" w:pos="6412"/>
-          <w:tab w:val="left" w:pos="7328"/>
-          <w:tab w:val="left" w:pos="8244"/>
-          <w:tab w:val="left" w:pos="9160"/>
-          <w:tab w:val="left" w:pos="10076"/>
-          <w:tab w:val="left" w:pos="10992"/>
-          <w:tab w:val="left" w:pos="11908"/>
-          <w:tab w:val="left" w:pos="12824"/>
-          <w:tab w:val="left" w:pos="13740"/>
-          <w:tab w:val="left" w:pos="14656"/>
-        </w:tabs>
-        <w:spacing w:after="0" w:line="23" w:lineRule="atLeast"/>
-        <w:rPr>
-          <w:rFonts w:ascii="Roboto Condensed" w:eastAsia="Times New Roman" w:hAnsi="Roboto Condensed" w:cs="Courier New"/>
-          <w:lang w:val="en-US"/>
-        </w:rPr>
-      </w:pPr>
-      <w:r>
-        <w:rPr>
-          <w:rFonts w:ascii="Roboto Condensed" w:eastAsia="Times New Roman" w:hAnsi="Roboto Condensed" w:cs="Courier New"/>
-          <w:lang w:val="en-US"/>
-        </w:rPr>
-        <w:t>Sprint Review:</w:t>
-      </w:r>
-    </w:p>
-    <w:p>
-      <w:pPr>
-        <w:tabs>
-          <w:tab w:val="left" w:pos="916"/>
-          <w:tab w:val="left" w:pos="1832"/>
-          <w:tab w:val="left" w:pos="2748"/>
-          <w:tab w:val="left" w:pos="3664"/>
-          <w:tab w:val="left" w:pos="4580"/>
-          <w:tab w:val="left" w:pos="5496"/>
-          <w:tab w:val="left" w:pos="6412"/>
-          <w:tab w:val="left" w:pos="7328"/>
-          <w:tab w:val="left" w:pos="8244"/>
-          <w:tab w:val="left" w:pos="9160"/>
-          <w:tab w:val="left" w:pos="10076"/>
-          <w:tab w:val="left" w:pos="10992"/>
-          <w:tab w:val="left" w:pos="11908"/>
-          <w:tab w:val="left" w:pos="12824"/>
-          <w:tab w:val="left" w:pos="13740"/>
-          <w:tab w:val="left" w:pos="14656"/>
-        </w:tabs>
-        <w:spacing w:after="0" w:line="23" w:lineRule="atLeast"/>
-        <w:rPr>
-          <w:rFonts w:ascii="Roboto Condensed" w:eastAsia="Times New Roman" w:hAnsi="Roboto Condensed" w:cs="Courier New"/>
-          <w:lang w:val="en-US"/>
-        </w:rPr>
-      </w:pPr>
-      <w:r>
-        <w:rPr>
-          <w:rFonts w:ascii="Roboto Condensed" w:eastAsia="Times New Roman" w:hAnsi="Roboto Condensed" w:cs="Courier New"/>
-          <w:lang w:val="en-US"/>
-        </w:rPr>
-        <w:t>The sprint increment demonstrated contact event creation after communication attempts, failed event handling, retry limit behavior, unsubscribe updating opt-out status, and contact history visibility on customer profiles.</w:t>
-      </w:r>
-    </w:p>
-    <w:p>
-      <w:pPr>
-        <w:tabs>
-          <w:tab w:val="left" w:pos="916"/>
-          <w:tab w:val="left" w:pos="1832"/>
-          <w:tab w:val="left" w:pos="2748"/>
-          <w:tab w:val="left" w:pos="3664"/>
-          <w:tab w:val="left" w:pos="4580"/>
-          <w:tab w:val="left" w:pos="5496"/>
-          <w:tab w:val="left" w:pos="6412"/>
-          <w:tab w:val="left" w:pos="7328"/>
-          <w:tab w:val="left" w:pos="8244"/>
-          <w:tab w:val="left" w:pos="9160"/>
-          <w:tab w:val="left" w:pos="10076"/>
-          <w:tab w:val="left" w:pos="10992"/>
-          <w:tab w:val="left" w:pos="11908"/>
-          <w:tab w:val="left" w:pos="12824"/>
-          <w:tab w:val="left" w:pos="13740"/>
-          <w:tab w:val="left" w:pos="14656"/>
-        </w:tabs>
-        <w:spacing w:after="0" w:line="23" w:lineRule="atLeast"/>
-        <w:rPr>
-          <w:rFonts w:ascii="Roboto Condensed" w:eastAsia="Times New Roman" w:hAnsi="Roboto Condensed" w:cs="Courier New"/>
-          <w:lang w:val="en-US"/>
-        </w:rPr>
-      </w:pPr>
-      <w:r>
-        <w:rPr>
-          <w:rFonts w:ascii="Roboto Condensed" w:eastAsia="Times New Roman" w:hAnsi="Roboto Condensed" w:cs="Courier New"/>
-          <w:lang w:val="en-US"/>
-        </w:rPr>
-        <w:t>Sprint Retrospective:</w:t>
-      </w:r>
-    </w:p>
-    <w:p>
-      <w:pPr>
-        <w:tabs>
-          <w:tab w:val="left" w:pos="916"/>
-          <w:tab w:val="left" w:pos="1832"/>
-          <w:tab w:val="left" w:pos="2748"/>
-          <w:tab w:val="left" w:pos="3664"/>
-          <w:tab w:val="left" w:pos="4580"/>
-          <w:tab w:val="left" w:pos="5496"/>
-          <w:tab w:val="left" w:pos="6412"/>
-          <w:tab w:val="left" w:pos="7328"/>
-          <w:tab w:val="left" w:pos="8244"/>
-          <w:tab w:val="left" w:pos="9160"/>
-          <w:tab w:val="left" w:pos="10076"/>
-          <w:tab w:val="left" w:pos="10992"/>
-          <w:tab w:val="left" w:pos="11908"/>
-          <w:tab w:val="left" w:pos="12824"/>
-          <w:tab w:val="left" w:pos="13740"/>
-          <w:tab w:val="left" w:pos="14656"/>
-        </w:tabs>
-        <w:spacing w:after="0" w:line="23" w:lineRule="atLeast"/>
-        <w:rPr>
-          <w:rFonts w:ascii="Roboto Condensed" w:eastAsia="Times New Roman" w:hAnsi="Roboto Condensed" w:cs="Courier New"/>
-          <w:lang w:val="en-US"/>
-        </w:rPr>
-      </w:pPr>
-      <w:r>
-        <w:rPr>
-          <w:rFonts w:ascii="Roboto Condensed" w:eastAsia="Times New Roman" w:hAnsi="Roboto Condensed" w:cs="Courier New"/>
-          <w:lang w:val="en-US"/>
-        </w:rPr>
-        <w:t>What went well: the provider adapter pattern kept development/test safe while preparing for real production providers.</w:t>
-      </w:r>
-    </w:p>
-    <w:p>
-      <w:pPr>
-        <w:tabs>
-          <w:tab w:val="left" w:pos="916"/>
-          <w:tab w:val="left" w:pos="1832"/>
-          <w:tab w:val="left" w:pos="2748"/>
-          <w:tab w:val="left" w:pos="3664"/>
-          <w:tab w:val="left" w:pos="4580"/>
-          <w:tab w:val="left" w:pos="5496"/>
-          <w:tab w:val="left" w:pos="6412"/>
-          <w:tab w:val="left" w:pos="7328"/>
-          <w:tab w:val="left" w:pos="8244"/>
-          <w:tab w:val="left" w:pos="9160"/>
-          <w:tab w:val="left" w:pos="10076"/>
-          <w:tab w:val="left" w:pos="10992"/>
-          <w:tab w:val="left" w:pos="11908"/>
-          <w:tab w:val="left" w:pos="12824"/>
-          <w:tab w:val="left" w:pos="13740"/>
-          <w:tab w:val="left" w:pos="14656"/>
-        </w:tabs>
-        <w:spacing w:after="0" w:line="23" w:lineRule="atLeast"/>
-        <w:rPr>
-          <w:rFonts w:ascii="Roboto Condensed" w:eastAsia="Times New Roman" w:hAnsi="Roboto Condensed" w:cs="Courier New"/>
-          <w:lang w:val="en-US"/>
-        </w:rPr>
-      </w:pPr>
-      <w:r>
-        <w:rPr>
-          <w:rFonts w:ascii="Roboto Condensed" w:eastAsia="Times New Roman" w:hAnsi="Roboto Condensed" w:cs="Courier New"/>
-          <w:lang w:val="en-US"/>
-        </w:rPr>
-        <w:t>What could improve: real provider integration details should remain clearly documented for production.</w:t>
-      </w:r>
-    </w:p>
-    <w:p>
-      <w:pPr>
-        <w:tabs>
-          <w:tab w:val="left" w:pos="916"/>
-          <w:tab w:val="left" w:pos="1832"/>
-          <w:tab w:val="left" w:pos="2748"/>
-          <w:tab w:val="left" w:pos="3664"/>
-          <w:tab w:val="left" w:pos="4580"/>
-          <w:tab w:val="left" w:pos="5496"/>
-          <w:tab w:val="left" w:pos="6412"/>
-          <w:tab w:val="left" w:pos="7328"/>
-          <w:tab w:val="left" w:pos="8244"/>
-          <w:tab w:val="left" w:pos="9160"/>
-          <w:tab w:val="left" w:pos="10076"/>
-          <w:tab w:val="left" w:pos="10992"/>
-          <w:tab w:val="left" w:pos="11908"/>
-          <w:tab w:val="left" w:pos="12824"/>
-          <w:tab w:val="left" w:pos="13740"/>
-          <w:tab w:val="left" w:pos="14656"/>
-        </w:tabs>
-        <w:spacing w:after="0" w:line="23" w:lineRule="atLeast"/>
-        <w:rPr>
-          <w:rFonts w:ascii="Roboto Condensed" w:eastAsia="Times New Roman" w:hAnsi="Roboto Condensed" w:cs="Courier New"/>
-          <w:lang w:val="en-US"/>
-        </w:rPr>
-      </w:pPr>
-      <w:r>
-        <w:rPr>
-          <w:rFonts w:ascii="Roboto Condensed" w:eastAsia="Times New Roman" w:hAnsi="Roboto Condensed" w:cs="Courier New"/>
-          <w:lang w:val="en-US"/>
-        </w:rPr>
-        <w:t>Action item: ensure production sending is disabled unless real provider configuration exists.</w:t>
-      </w:r>
-    </w:p>
-    <w:p>
-      <w:pPr>
-        <w:tabs>
-          <w:tab w:val="left" w:pos="916"/>
-          <w:tab w:val="left" w:pos="1832"/>
-          <w:tab w:val="left" w:pos="2748"/>
-          <w:tab w:val="left" w:pos="3664"/>
-          <w:tab w:val="left" w:pos="4580"/>
-          <w:tab w:val="left" w:pos="5496"/>
-          <w:tab w:val="left" w:pos="6412"/>
-          <w:tab w:val="left" w:pos="7328"/>
-          <w:tab w:val="left" w:pos="8244"/>
-          <w:tab w:val="left" w:pos="9160"/>
-          <w:tab w:val="left" w:pos="10076"/>
-          <w:tab w:val="left" w:pos="10992"/>
-          <w:tab w:val="left" w:pos="11908"/>
-          <w:tab w:val="left" w:pos="12824"/>
-          <w:tab w:val="left" w:pos="13740"/>
-          <w:tab w:val="left" w:pos="14656"/>
-        </w:tabs>
-        <w:spacing w:after="0" w:line="23" w:lineRule="atLeast"/>
-        <w:rPr>
-          <w:rFonts w:ascii="Roboto Condensed" w:eastAsia="Times New Roman" w:hAnsi="Roboto Condensed" w:cs="Courier New"/>
-          <w:lang w:val="en-US"/>
-        </w:rPr>
-      </w:pPr>
-      <w:r>
-        <w:rPr>
-          <w:rFonts w:ascii="Roboto Condensed" w:eastAsia="Times New Roman" w:hAnsi="Roboto Condensed" w:cs="Courier New"/>
-          <w:lang w:val="en-US"/>
-        </w:rPr>
-        <w:t>Roadmap Update:</w:t>
-      </w:r>
-    </w:p>
-    <w:p>
-      <w:pPr>
-        <w:tabs>
-          <w:tab w:val="left" w:pos="916"/>
-          <w:tab w:val="left" w:pos="1832"/>
-          <w:tab w:val="left" w:pos="2748"/>
-          <w:tab w:val="left" w:pos="3664"/>
-          <w:tab w:val="left" w:pos="4580"/>
-          <w:tab w:val="left" w:pos="5496"/>
-          <w:tab w:val="left" w:pos="6412"/>
-          <w:tab w:val="left" w:pos="7328"/>
-          <w:tab w:val="left" w:pos="8244"/>
-          <w:tab w:val="left" w:pos="9160"/>
-          <w:tab w:val="left" w:pos="10076"/>
-          <w:tab w:val="left" w:pos="10992"/>
-          <w:tab w:val="left" w:pos="11908"/>
-          <w:tab w:val="left" w:pos="12824"/>
-          <w:tab w:val="left" w:pos="13740"/>
-          <w:tab w:val="left" w:pos="14656"/>
-        </w:tabs>
-        <w:spacing w:after="0" w:line="23" w:lineRule="atLeast"/>
-        <w:rPr>
-          <w:rFonts w:ascii="Roboto Condensed" w:eastAsia="Times New Roman" w:hAnsi="Roboto Condensed" w:cs="Courier New"/>
-          <w:lang w:val="en-US"/>
-        </w:rPr>
-      </w:pPr>
-      <w:r>
-        <w:rPr>
-          <w:rFonts w:ascii="Roboto Condensed" w:eastAsia="Times New Roman" w:hAnsi="Roboto Condensed" w:cs="Courier New"/>
-          <w:lang w:val="en-US"/>
-        </w:rPr>
-        <w:t>Sprint 10 completed communication tracking and provider adapters. Related epics: BWCO-16 Communication tracking; BWCO-24 Testing and QA.</w:t>
-      </w:r>
-    </w:p>
-    <w:p>
-      <w:pPr>
-        <w:tabs>
-          <w:tab w:val="left" w:pos="916"/>
-          <w:tab w:val="left" w:pos="1832"/>
-          <w:tab w:val="left" w:pos="2748"/>
-          <w:tab w:val="left" w:pos="3664"/>
-          <w:tab w:val="left" w:pos="4580"/>
-          <w:tab w:val="left" w:pos="5496"/>
-          <w:tab w:val="left" w:pos="6412"/>
-          <w:tab w:val="left" w:pos="7328"/>
-          <w:tab w:val="left" w:pos="8244"/>
-          <w:tab w:val="left" w:pos="9160"/>
-          <w:tab w:val="left" w:pos="10076"/>
-          <w:tab w:val="left" w:pos="10992"/>
-          <w:tab w:val="left" w:pos="11908"/>
-          <w:tab w:val="left" w:pos="12824"/>
-          <w:tab w:val="left" w:pos="13740"/>
-          <w:tab w:val="left" w:pos="14656"/>
-        </w:tabs>
-        <w:spacing w:after="0" w:line="23" w:lineRule="atLeast"/>
-        <w:rPr>
-          <w:rFonts w:ascii="Roboto Condensed" w:eastAsia="Times New Roman" w:hAnsi="Roboto Condensed" w:cs="Courier New"/>
-          <w:lang w:val="en-US"/>
-        </w:rPr>
-      </w:pPr>
-    </w:p>
-    <w:p>
-      <w:pPr>
-        <w:tabs>
-          <w:tab w:val="left" w:pos="916"/>
-          <w:tab w:val="left" w:pos="1832"/>
-          <w:tab w:val="left" w:pos="2748"/>
-          <w:tab w:val="left" w:pos="3664"/>
-          <w:tab w:val="left" w:pos="4580"/>
-          <w:tab w:val="left" w:pos="5496"/>
-          <w:tab w:val="left" w:pos="6412"/>
-          <w:tab w:val="left" w:pos="7328"/>
-          <w:tab w:val="left" w:pos="8244"/>
-          <w:tab w:val="left" w:pos="9160"/>
-          <w:tab w:val="left" w:pos="10076"/>
-          <w:tab w:val="left" w:pos="10992"/>
-          <w:tab w:val="left" w:pos="11908"/>
-          <w:tab w:val="left" w:pos="12824"/>
-          <w:tab w:val="left" w:pos="13740"/>
-          <w:tab w:val="left" w:pos="14656"/>
-        </w:tabs>
-        <w:spacing w:after="0" w:line="23" w:lineRule="atLeast"/>
-        <w:rPr>
-          <w:rFonts w:ascii="Roboto Condensed" w:eastAsia="Times New Roman" w:hAnsi="Roboto Condensed" w:cs="Courier New"/>
-          <w:lang w:val="en-US"/>
-        </w:rPr>
-      </w:pPr>
-      <w:r>
-        <w:rPr>
-          <w:rFonts w:ascii="Roboto Condensed" w:eastAsia="Times New Roman" w:hAnsi="Roboto Condensed" w:cs="Courier New"/>
-          <w:lang w:val="en-US"/>
-        </w:rPr>
-        <w:t>Evidence to Attach:</w:t>
-      </w:r>
-    </w:p>
-    <w:p>
-      <w:pPr>
-        <w:tabs>
-          <w:tab w:val="left" w:pos="916"/>
-          <w:tab w:val="left" w:pos="1832"/>
-          <w:tab w:val="left" w:pos="2748"/>
-          <w:tab w:val="left" w:pos="3664"/>
-          <w:tab w:val="left" w:pos="4580"/>
-          <w:tab w:val="left" w:pos="5496"/>
-          <w:tab w:val="left" w:pos="6412"/>
-          <w:tab w:val="left" w:pos="7328"/>
-          <w:tab w:val="left" w:pos="8244"/>
-          <w:tab w:val="left" w:pos="9160"/>
-          <w:tab w:val="left" w:pos="10076"/>
-          <w:tab w:val="left" w:pos="10992"/>
-          <w:tab w:val="left" w:pos="11908"/>
-          <w:tab w:val="left" w:pos="12824"/>
-          <w:tab w:val="left" w:pos="13740"/>
-          <w:tab w:val="left" w:pos="14656"/>
-        </w:tabs>
-        <w:spacing w:after="0" w:line="23" w:lineRule="atLeast"/>
-        <w:rPr>
-          <w:rFonts w:ascii="Roboto Condensed" w:eastAsia="Times New Roman" w:hAnsi="Roboto Condensed" w:cs="Courier New"/>
-          <w:lang w:val="en-US"/>
-        </w:rPr>
-      </w:pPr>
-      <w:r>
-        <w:rPr>
-          <w:rFonts w:ascii="Roboto Condensed" w:eastAsia="Times New Roman" w:hAnsi="Roboto Condensed" w:cs="Courier New"/>
-          <w:lang w:val="en-US"/>
-        </w:rPr>
-        <w:t xml:space="preserve">Contact history screenshot, contact timeline screenshot, communication event screenshot, mock provider screenshot, unsubscribe/opt-out </w:t>
-      </w:r>
+        <w:t xml:space="preserve"> timeline screenshot, c</w:t>
+      </w:r>
+    </w:p>
+    <w:p>
+      <w:pPr>
+        <w:tabs>
+          <w:tab w:val="left" w:pos="916"/>
+          <w:tab w:val="left" w:pos="1832"/>
+          <w:tab w:val="left" w:pos="2748"/>
+          <w:tab w:val="left" w:pos="3664"/>
+          <w:tab w:val="left" w:pos="4580"/>
+          <w:tab w:val="left" w:pos="5496"/>
+          <w:tab w:val="left" w:pos="6412"/>
+          <w:tab w:val="left" w:pos="7328"/>
+          <w:tab w:val="left" w:pos="8244"/>
+          <w:tab w:val="left" w:pos="9160"/>
+          <w:tab w:val="left" w:pos="10076"/>
+          <w:tab w:val="left" w:pos="10992"/>
+          <w:tab w:val="left" w:pos="11908"/>
+          <w:tab w:val="left" w:pos="12824"/>
+          <w:tab w:val="left" w:pos="13740"/>
+          <w:tab w:val="left" w:pos="14656"/>
+        </w:tabs>
+        <w:spacing w:after="0" w:line="23" w:lineRule="atLeast"/>
+        <w:rPr>
+          <w:rFonts w:ascii="Roboto Condensed" w:eastAsia="Times New Roman" w:hAnsi="Roboto Condensed" w:cs="Courier New"/>
+          <w:lang w:val="en-US"/>
+        </w:rPr>
+      </w:pPr>
       <w:proofErr w:type="gramStart"/>
       <w:r>
         <w:rPr>
           <w:rFonts w:ascii="Roboto Condensed" w:eastAsia="Times New Roman" w:hAnsi="Roboto Condensed" w:cs="Courier New"/>
           <w:lang w:val="en-US"/>
         </w:rPr>
-        <w:t>screenshot,</w:t>
+        <w:t>ommunication</w:t>
       </w:r>
       <w:proofErr w:type="gramEnd"/>
       <w:r>
@@ -595,7 +241,186 @@
           <w:rFonts w:ascii="Roboto Condensed" w:eastAsia="Times New Roman" w:hAnsi="Roboto Condensed" w:cs="Courier New"/>
           <w:lang w:val="en-US"/>
         </w:rPr>
-        <w:t xml:space="preserve"> retry limit test screenshot, provider config note screenshot, Sprint 10 review note, Sprint 10 retrospective note.</w:t>
+        <w:t xml:space="preserve"> event screenshot,</w:t>
+      </w:r>
+    </w:p>
+    <w:p>
+      <w:pPr>
+        <w:tabs>
+          <w:tab w:val="left" w:pos="916"/>
+          <w:tab w:val="left" w:pos="1832"/>
+          <w:tab w:val="left" w:pos="2748"/>
+          <w:tab w:val="left" w:pos="3664"/>
+          <w:tab w:val="left" w:pos="4580"/>
+          <w:tab w:val="left" w:pos="5496"/>
+          <w:tab w:val="left" w:pos="6412"/>
+          <w:tab w:val="left" w:pos="7328"/>
+          <w:tab w:val="left" w:pos="8244"/>
+          <w:tab w:val="left" w:pos="9160"/>
+          <w:tab w:val="left" w:pos="10076"/>
+          <w:tab w:val="left" w:pos="10992"/>
+          <w:tab w:val="left" w:pos="11908"/>
+          <w:tab w:val="left" w:pos="12824"/>
+          <w:tab w:val="left" w:pos="13740"/>
+          <w:tab w:val="left" w:pos="14656"/>
+        </w:tabs>
+        <w:spacing w:after="0" w:line="23" w:lineRule="atLeast"/>
+        <w:rPr>
+          <w:rFonts w:ascii="Roboto Condensed" w:eastAsia="Times New Roman" w:hAnsi="Roboto Condensed" w:cs="Courier New"/>
+          <w:lang w:val="en-US"/>
+        </w:rPr>
+      </w:pPr>
+      <w:r>
+        <w:rPr>
+          <w:rFonts w:ascii="Roboto Condensed" w:eastAsia="Times New Roman" w:hAnsi="Roboto Condensed" w:cs="Courier New"/>
+          <w:lang w:val="en-US"/>
+        </w:rPr>
+        <w:t xml:space="preserve"> </w:t>
+      </w:r>
+      <w:proofErr w:type="gramStart"/>
+      <w:r>
+        <w:rPr>
+          <w:rFonts w:ascii="Roboto Condensed" w:eastAsia="Times New Roman" w:hAnsi="Roboto Condensed" w:cs="Courier New"/>
+          <w:lang w:val="en-US"/>
+        </w:rPr>
+        <w:t>mock</w:t>
+      </w:r>
+      <w:proofErr w:type="gramEnd"/>
+      <w:r>
+        <w:rPr>
+          <w:rFonts w:ascii="Roboto Condensed" w:eastAsia="Times New Roman" w:hAnsi="Roboto Condensed" w:cs="Courier New"/>
+          <w:lang w:val="en-US"/>
+        </w:rPr>
+        <w:t xml:space="preserve"> provider screenshot, </w:t>
+      </w:r>
+    </w:p>
+    <w:p>
+      <w:pPr>
+        <w:tabs>
+          <w:tab w:val="left" w:pos="916"/>
+          <w:tab w:val="left" w:pos="1832"/>
+          <w:tab w:val="left" w:pos="2748"/>
+          <w:tab w:val="left" w:pos="3664"/>
+          <w:tab w:val="left" w:pos="4580"/>
+          <w:tab w:val="left" w:pos="5496"/>
+          <w:tab w:val="left" w:pos="6412"/>
+          <w:tab w:val="left" w:pos="7328"/>
+          <w:tab w:val="left" w:pos="8244"/>
+          <w:tab w:val="left" w:pos="9160"/>
+          <w:tab w:val="left" w:pos="10076"/>
+          <w:tab w:val="left" w:pos="10992"/>
+          <w:tab w:val="left" w:pos="11908"/>
+          <w:tab w:val="left" w:pos="12824"/>
+          <w:tab w:val="left" w:pos="13740"/>
+          <w:tab w:val="left" w:pos="14656"/>
+        </w:tabs>
+        <w:spacing w:after="0" w:line="23" w:lineRule="atLeast"/>
+        <w:rPr>
+          <w:rFonts w:ascii="Roboto Condensed" w:eastAsia="Times New Roman" w:hAnsi="Roboto Condensed" w:cs="Courier New"/>
+          <w:lang w:val="en-US"/>
+        </w:rPr>
+      </w:pPr>
+      <w:proofErr w:type="gramStart"/>
+      <w:r>
+        <w:rPr>
+          <w:rFonts w:ascii="Roboto Condensed" w:eastAsia="Times New Roman" w:hAnsi="Roboto Condensed" w:cs="Courier New"/>
+          <w:lang w:val="en-US"/>
+        </w:rPr>
+        <w:t>unsubscribe/opt-out</w:t>
+      </w:r>
+      <w:proofErr w:type="gramEnd"/>
+      <w:r>
+        <w:rPr>
+          <w:rFonts w:ascii="Roboto Condensed" w:eastAsia="Times New Roman" w:hAnsi="Roboto Condensed" w:cs="Courier New"/>
+          <w:lang w:val="en-US"/>
+        </w:rPr>
+        <w:t xml:space="preserve"> screenshot, r</w:t>
+      </w:r>
+    </w:p>
+    <w:p>
+      <w:pPr>
+        <w:tabs>
+          <w:tab w:val="left" w:pos="916"/>
+          <w:tab w:val="left" w:pos="1832"/>
+          <w:tab w:val="left" w:pos="2748"/>
+          <w:tab w:val="left" w:pos="3664"/>
+          <w:tab w:val="left" w:pos="4580"/>
+          <w:tab w:val="left" w:pos="5496"/>
+          <w:tab w:val="left" w:pos="6412"/>
+          <w:tab w:val="left" w:pos="7328"/>
+          <w:tab w:val="left" w:pos="8244"/>
+          <w:tab w:val="left" w:pos="9160"/>
+          <w:tab w:val="left" w:pos="10076"/>
+          <w:tab w:val="left" w:pos="10992"/>
+          <w:tab w:val="left" w:pos="11908"/>
+          <w:tab w:val="left" w:pos="12824"/>
+          <w:tab w:val="left" w:pos="13740"/>
+          <w:tab w:val="left" w:pos="14656"/>
+        </w:tabs>
+        <w:spacing w:after="0" w:line="23" w:lineRule="atLeast"/>
+        <w:rPr>
+          <w:rFonts w:ascii="Roboto Condensed" w:eastAsia="Times New Roman" w:hAnsi="Roboto Condensed" w:cs="Courier New"/>
+          <w:lang w:val="en-US"/>
+        </w:rPr>
+      </w:pPr>
+      <w:proofErr w:type="gramStart"/>
+      <w:r>
+        <w:rPr>
+          <w:rFonts w:ascii="Roboto Condensed" w:eastAsia="Times New Roman" w:hAnsi="Roboto Condensed" w:cs="Courier New"/>
+          <w:lang w:val="en-US"/>
+        </w:rPr>
+        <w:t>etry</w:t>
+      </w:r>
+      <w:proofErr w:type="gramEnd"/>
+      <w:r>
+        <w:rPr>
+          <w:rFonts w:ascii="Roboto Condensed" w:eastAsia="Times New Roman" w:hAnsi="Roboto Condensed" w:cs="Courier New"/>
+          <w:lang w:val="en-US"/>
+        </w:rPr>
+        <w:t xml:space="preserve"> limit test screenshot, </w:t>
+      </w:r>
+    </w:p>
+    <w:p>
+      <w:pPr>
+        <w:tabs>
+          <w:tab w:val="left" w:pos="916"/>
+          <w:tab w:val="left" w:pos="1832"/>
+          <w:tab w:val="left" w:pos="2748"/>
+          <w:tab w:val="left" w:pos="3664"/>
+          <w:tab w:val="left" w:pos="4580"/>
+          <w:tab w:val="left" w:pos="5496"/>
+          <w:tab w:val="left" w:pos="6412"/>
+          <w:tab w:val="left" w:pos="7328"/>
+          <w:tab w:val="left" w:pos="8244"/>
+          <w:tab w:val="left" w:pos="9160"/>
+          <w:tab w:val="left" w:pos="10076"/>
+          <w:tab w:val="left" w:pos="10992"/>
+          <w:tab w:val="left" w:pos="11908"/>
+          <w:tab w:val="left" w:pos="12824"/>
+          <w:tab w:val="left" w:pos="13740"/>
+          <w:tab w:val="left" w:pos="14656"/>
+        </w:tabs>
+        <w:spacing w:after="0" w:line="23" w:lineRule="atLeast"/>
+        <w:rPr>
+          <w:rFonts w:ascii="Roboto Condensed" w:eastAsia="Times New Roman" w:hAnsi="Roboto Condensed" w:cs="Courier New"/>
+          <w:lang w:val="en-US"/>
+        </w:rPr>
+      </w:pPr>
+      <w:proofErr w:type="gramStart"/>
+      <w:r>
+        <w:rPr>
+          <w:rFonts w:ascii="Roboto Condensed" w:eastAsia="Times New Roman" w:hAnsi="Roboto Condensed" w:cs="Courier New"/>
+          <w:lang w:val="en-US"/>
+        </w:rPr>
+        <w:t>provider</w:t>
+      </w:r>
+      <w:proofErr w:type="gramEnd"/>
+      <w:r>
+        <w:rPr>
+          <w:rFonts w:ascii="Roboto Condensed" w:eastAsia="Times New Roman" w:hAnsi="Roboto Condensed" w:cs="Courier New"/>
+          <w:lang w:val="en-US"/>
+        </w:rPr>
+        <w:t xml:space="preserve"> config note screenshot, </w:t>
       </w:r>
     </w:p>
     <w:p>
@@ -611,6 +436,8 @@
         </w:rPr>
         <w:br w:type="page"/>
       </w:r>
+      <w:bookmarkStart w:id="0" w:name="_GoBack"/>
+      <w:bookmarkEnd w:id="0"/>
     </w:p>
     <w:p>
       <w:pPr>
@@ -12632,8 +12459,6 @@
         </w:rPr>
         <w:t>.</w:t>
       </w:r>
-      <w:bookmarkStart w:id="0" w:name="_GoBack"/>
-      <w:bookmarkEnd w:id="0"/>
     </w:p>
     <w:p>
       <w:pPr>

</xml_diff>